<commit_message>
chore(tcc): salva estado atual do documento (README, template.tex e build)
Checkpoint antes da rodada de curadoria: sincroniza README.md/README_word.md
com o template.tex e o build LaTeX (pdf/aux/toc), e remove arquivos temporarios
de lock do Word (~$mplate*.docx).
</commit_message>
<xml_diff>
--- a/docs/TCC/template_tcc_bcc/template_limpo.docx
+++ b/docs/TCC/template_tcc_bcc/template_limpo.docx
@@ -124,7 +124,7 @@
         <w:t xml:space="preserve">sock puppet audit</w:t>
       </w:r>
       <w:r>
-        <w:t xml:space="preserve">), com quatro personas sintéticas de arquétipos contrastantes —</w:t>
+        <w:t xml:space="preserve">), com quatro personas sintéticas de arquétipos contrastantes,</w:t>
       </w:r>
       <w:r>
         <w:t xml:space="preserve"> </w:t>
@@ -147,7 +147,7 @@
         <w:t xml:space="preserve">lo-fi</w:t>
       </w:r>
       <w:r>
-        <w:t xml:space="preserve">, nostálgico e de nicho —, comparando-se os estímulos declarados (</w:t>
+        <w:t xml:space="preserve">, nostálgico e de nicho, comparando-se os estímulos declarados (</w:t>
       </w:r>
       <w:r>
         <w:rPr>
@@ -199,7 +199,7 @@
         <w:t xml:space="preserve"> </w:t>
       </w:r>
       <w:r>
-        <w:t xml:space="preserve">do Spotify durante a pesquisa — fato tratado como meta-evidência da opacidade da plataforma —, os dados foram enriquecidos com as fontes externas Last.fm e MusicBrainz. Mensuraram-se a diversidade e a concentração por meio da Entropia de Shannon, da</w:t>
+        <w:t xml:space="preserve">do Spotify durante a pesquisa, fato tratado como meta-evidência da opacidade da plataforma, os dados foram enriquecidos com as fontes externas Last.fm e MusicBrainz. Mensuraram-se a diversidade e a concentração por meio da Entropia de Shannon, da</w:t>
       </w:r>
       <w:r>
         <w:t xml:space="preserve"> </w:t>
@@ -289,7 +289,7 @@
         <w:pStyle w:val="FirstParagraph"/>
       </w:pPr>
       <w:r>
-        <w:t xml:space="preserve">Algorithmic recommender systems have become the main mediators between musical works and listeners, operating as black boxes whose selection criteria remain opaque. This study audits Spotify’s recommendation system from an Information Management perspective, investigating whether automated curation fosters cultural diversity or the homogenization of musical taste. A black-box, sock-puppet auditing methodology was adopted, using four synthetic personas of contrasting archetypes — mainstream, functional/lo-fi, nostalgic, and niche — comparing the declared stimuli (input) with the recommendations generated in the Daily Mixes (output). Given the progressive removal of fields from the Spotify Web API during the research — treated here as meta-evidence of the platform’s opacity —, the data were enriched with the external sources Last.fm and MusicBrainz. Diversity and concentration were measured through Shannon entropy, Pielou’s evenness, the Gini coefficient, the Herfindahl-Hirschman Index, and the Jaccard index, with inferential statistical treatment (bootstrap confidence intervals, the Mann-Whitney test, rarefaction, and a permutation test). The results reveal a three-level phenomenon: at the content level, the personas’ artist repertoires remain entirely disjoint (Jaccard = 0, more segregated than chance, p &lt; 0.001); at the thematic level, there is partial genre convergence; and at the magnitude level, diversity converges through catalog richness expansion rather than entropy homogenization. A popularity bias (Daniel, +131% listeners per artist) and a hit bias within the long tail (Sofia, +405% listeners per track) are also confirmed. We conclude that the algorithm does not homogenize taste across users: it expands the internal richness of each profile and brings them thematically closer, while preserving distinct content silos.</w:t>
+        <w:t xml:space="preserve">Algorithmic recommender systems have become the main mediators between musical works and listeners, operating as black boxes whose selection criteria remain opaque. This study audits Spotify’s recommendation system from an Information Management perspective, investigating whether automated curation fosters cultural diversity or the homogenization of musical taste. A black-box, sock-puppet auditing methodology was adopted, using four synthetic personas of contrasting archetypes, mainstream, functional/lo-fi, nostalgic, and niche, comparing the declared stimuli (input) with the recommendations generated in the Daily Mixes (output). Given the progressive removal of fields from the Spotify Web API during the research, treated here as meta-evidence of the platform’s opacity, the data were enriched with the external sources Last.fm and MusicBrainz. Diversity and concentration were measured through Shannon entropy, Pielou’s evenness, the Gini coefficient, the Herfindahl-Hirschman Index, and the Jaccard index, with inferential statistical treatment (bootstrap confidence intervals, the Mann-Whitney test, rarefaction, and a permutation test). The results reveal a three-level phenomenon: at the content level, the personas’ artist repertoires remain entirely disjoint (Jaccard = 0, more segregated than chance, p &lt; 0.001); at the thematic level, there is partial genre convergence; and at the magnitude level, diversity converges through catalog richness expansion rather than entropy homogenization. A popularity bias (Daniel, +131% listeners per artist) and a hit bias within the long tail (Sofia, +405% listeners per track) are also confirmed. We conclude that the algorithm does not homogenize taste across users: it expands the internal richness of each profile and brings them thematically closer, while preserving distinct content silos.</w:t>
       </w:r>
     </w:p>
     <w:p>
@@ -414,7 +414,7 @@
         <w:t xml:space="preserve"> </w:t>
       </w:r>
       <w:r>
-        <w:t xml:space="preserve">no domínio da recomendação musical — onde, como se verá no Capítulo 4, os próprios dados sugerem um comportamento mais sutil do que a metáfora clássica da bolha prevê (o algoritmo chega a</w:t>
+        <w:t xml:space="preserve">no domínio da recomendação musical, onde, como se verá no Capítulo 4, os próprios dados sugerem um comportamento mais sutil do que a metáfora clássica da bolha prevê (o algoritmo chega a</w:t>
       </w:r>
       <w:r>
         <w:t xml:space="preserve"> </w:t>
@@ -634,7 +634,7 @@
         </w:numPr>
       </w:pPr>
       <w:r>
-        <w:t xml:space="preserve">Avaliar o fenômeno de Colapso de Contexto, investigando se as recomendações para perfis distintos convergem entre si — distinguindo a convergência de</w:t>
+        <w:t xml:space="preserve">Avaliar o fenômeno de Colapso de Contexto, investigando se as recomendações para perfis distintos convergem entre si, distinguindo a convergência de</w:t>
       </w:r>
       <w:r>
         <w:t xml:space="preserve"> </w:t>
@@ -682,7 +682,7 @@
         <w:t xml:space="preserve"> </w:t>
       </w:r>
       <w:r>
-        <w:t xml:space="preserve">de diversidade (Entropia de Shannon) — em vez de pressupor uma homogeneização única e indiferenciada.</w:t>
+        <w:t xml:space="preserve">de diversidade (Entropia de Shannon), em vez de pressupor uma homogeneização única e indiferenciada.</w:t>
       </w:r>
     </w:p>
     <w:bookmarkEnd w:id="13"/>
@@ -791,7 +791,7 @@
         <w:t xml:space="preserve">black boxes</w:t>
       </w:r>
       <w:r>
-        <w:t xml:space="preserve">), cujos critérios de seleção permanecem proprietários e opacos, gerando assimetria informacional entre a plataforma e o usuário — e também entre a plataforma e o pesquisador. Eriksson et al. (2019), em</w:t>
+        <w:t xml:space="preserve">), cujos critérios de seleção permanecem proprietários e opacos, gerando assimetria informacional entre a plataforma e o usuário, e também entre a plataforma e o pesquisador. Eriksson et al. (2019), em</w:t>
       </w:r>
       <w:r>
         <w:t xml:space="preserve"> </w:t>
@@ -844,7 +844,7 @@
         <w:t xml:space="preserve">feedback loop</w:t>
       </w:r>
       <w:r>
-        <w:t xml:space="preserve">) em que o popular ganha visibilidade enquanto produções novas, experimentais ou de nicho tendem a ser marginalizadas — pano de fundo para os vieses investigados neste trabalho.</w:t>
+        <w:t xml:space="preserve">) em que o popular ganha visibilidade enquanto produções novas, experimentais ou de nicho tendem a ser marginalizadas, pano de fundo para os vieses investigados neste trabalho.</w:t>
       </w:r>
     </w:p>
     <w:bookmarkEnd w:id="15"/>
@@ -1046,7 +1046,7 @@
         <w:t xml:space="preserve"> </w:t>
       </w:r>
       <w:r>
-        <w:t xml:space="preserve">entre usuários. Tais achados situam a pergunta central deste trabalho — se o algoritmo do Spotify aproxima ou afasta perfis distintos — em uma tradição consolidada de pesquisa.</w:t>
+        <w:t xml:space="preserve">entre usuários. Tais achados situam a pergunta central deste trabalho, se o algoritmo do Spotify aproxima ou afasta perfis distintos, em uma tradição consolidada de pesquisa.</w:t>
       </w:r>
     </w:p>
     <w:bookmarkEnd w:id="17"/>
@@ -1137,7 +1137,7 @@
         <w:t xml:space="preserve"> </w:t>
       </w:r>
       <w:r>
-        <w:t xml:space="preserve">(PIELOU, 1966), que normaliza a entropia pelo seu teto teórico; e, para um tratamento unificado das ordens de diversidade, à formalização de Jost (2006). A distinção é crucial: como alertam Gotelli e Colwell (2001), comparar riqueza entre amostras de tamanhos diferentes é inválido sem padronização (rarefação), sob pena de confundir efeito real com artefato de esforço amostral — armadilha diretamente relevante a esta auditoria.</w:t>
+        <w:t xml:space="preserve">(PIELOU, 1966), que normaliza a entropia pelo seu teto teórico; e, para um tratamento unificado das ordens de diversidade, à formalização de Jost (2006). A distinção é crucial: como alertam Gotelli e Colwell (2001), comparar riqueza entre amostras de tamanhos diferentes é inválido sem padronização (rarefação), sob pena de confundir efeito real com artefato de esforço amostral, armadilha diretamente relevante a esta auditoria.</w:t>
       </w:r>
     </w:p>
     <w:p>
@@ -1267,10 +1267,7 @@
         <w:t xml:space="preserve">sock puppet audit</w:t>
       </w:r>
       <w:r>
-        <w:t xml:space="preserve"> </w:t>
-      </w:r>
-      <w:r>
-        <w:t xml:space="preserve">— agentes-sonda que se passam por usuários reais —, desenho adotado neste estudo. Por operar sobre saídas ruidosas, esse paradigma exige rigor inferencial: a ferramenta AdFisher (DATTA; TSCHANTZ; DATTA, 2015) recorre a testes de permutação justamente para assegurar a validade estatística de seus achados. Essas referências fundamentam tanto o desenho experimental quanto o tratamento estatístico (§3.1.2.1) desta pesquisa.</w:t>
+        <w:t xml:space="preserve">, agentes-sonda que se passam por usuários reais, desenho adotado neste estudo. Por operar sobre saídas ruidosas, esse paradigma exige rigor inferencial: a ferramenta AdFisher (DATTA; TSCHANTZ; DATTA, 2015) recorre a testes de permutação justamente para assegurar a validade estatística de seus achados. Essas referências fundamentam tanto o desenho experimental quanto o tratamento estatístico (§3.1.2.1) desta pesquisa.</w:t>
       </w:r>
     </w:p>
     <w:bookmarkEnd w:id="19"/>
@@ -1345,7 +1342,7 @@
         <w:t xml:space="preserve"> </w:t>
       </w:r>
       <w:r>
-        <w:t xml:space="preserve">entre engajamento e diversidade — referência incontornável para o diálogo com os achados deste trabalho. A agenda mantém-se ativa: pesquisas recentes examinam o viés de popularidade em serviços comerciais (TURNBULL et al., 2022), a promoção (ou não) de música local pelos recomendadores (MATROSOVA et al., 2024) e os efeitos de escala sobre a hipótese da bolha de filtro (SHAKESPEARE; CHAREYRON; ROTH, 2025), situando esta investigação em uma discussão contemporânea e em curso.</w:t>
+        <w:t xml:space="preserve">entre engajamento e diversidade, referência incontornável para o diálogo com os achados deste trabalho. A agenda mantém-se ativa: pesquisas recentes examinam o viés de popularidade em serviços comerciais (TURNBULL et al., 2022), a promoção (ou não) de música local pelos recomendadores (MATROSOVA et al., 2024) e os efeitos de escala sobre a hipótese da bolha de filtro (SHAKESPEARE; CHAREYRON; ROTH, 2025), situando esta investigação em uma discussão contemporânea e em curso.</w:t>
       </w:r>
     </w:p>
     <w:bookmarkEnd w:id="20"/>
@@ -2071,7 +2068,7 @@
         <w:t xml:space="preserve"> </w:t>
       </w:r>
       <w:r>
-        <w:t xml:space="preserve">Diferentemente do HHI de mercado clássico — cujo limiar de concentração se situa em torno de 0,25 —, aqui o índice é calculado sobre a distribuição de centenas de</w:t>
+        <w:t xml:space="preserve">Diferentemente do HHI de mercado clássico, cujo limiar de concentração se situa em torno de 0,25, aqui o índice é calculado sobre a distribuição de centenas de</w:t>
       </w:r>
       <w:r>
         <w:t xml:space="preserve"> </w:t>
@@ -2907,7 +2904,7 @@
         <w:pStyle w:val="FirstParagraph"/>
       </w:pPr>
       <w:r>
-        <w:t xml:space="preserve">Dado que os produtos algorítmicos auditados são intrinsecamente ruidosos e que o desenho experimental opera com um número reduzido de agentes sintéticos (n = 4 personas), seguindo a tradição da auditoria de caixa-preta por agentes-sonda (SANDVIG et al., 2014) — na qual a ferramenta AdFisher recorre a testes de permutação justamente porque a saída observada é estocástica (DATTA; TSCHANTZ; DATTA, 2015) —, adotou-se um tratamento inferencial complementar às estimativas pontuais, implementado em</w:t>
+        <w:t xml:space="preserve">Dado que os produtos algorítmicos auditados são intrinsecamente ruidosos e que o desenho experimental opera com um número reduzido de agentes sintéticos (n = 4 personas), seguindo a tradição da auditoria de caixa-preta por agentes-sonda (SANDVIG et al., 2014), na qual a ferramenta AdFisher recorre a testes de permutação justamente porque a saída observada é estocástica (DATTA; TSCHANTZ; DATTA, 2015), adotou-se um tratamento inferencial complementar às estimativas pontuais, implementado em</w:t>
       </w:r>
       <w:r>
         <w:t xml:space="preserve"> </w:t>
@@ -3040,7 +3037,7 @@
         <w:t xml:space="preserve"> </w:t>
       </w:r>
       <w:r>
-        <w:t xml:space="preserve">com reposição não é aplicado às métricas de forma (Shannon, Pielou, Gini, riqueza), pois nelas é enviesado para baixo — a essas reserva-se a rarefação (ver adiante).</w:t>
+        <w:t xml:space="preserve">com reposição não é aplicado às métricas de forma (Shannon, Pielou, Gini, riqueza), pois nelas é enviesado para baixo, a essas reserva-se a rarefação (ver adiante).</w:t>
       </w:r>
     </w:p>
     <w:p>
@@ -3431,10 +3428,7 @@
         <w:t xml:space="preserve">Extended Quota Mode</w:t>
       </w:r>
       <w:r>
-        <w:t xml:space="preserve"> </w:t>
-      </w:r>
-      <w:r>
-        <w:t xml:space="preserve">— cujo processo de aprovação tem taxa de sucesso historicamente baixa para projetos acadêmicos — adotou-se um</w:t>
+        <w:t xml:space="preserve">, cujo processo de aprovação tem taxa de sucesso historicamente baixa para projetos acadêmicos, adotou-se um</w:t>
       </w:r>
       <w:r>
         <w:t xml:space="preserve"> </w:t>
@@ -3776,7 +3770,7 @@
         <w:t xml:space="preserve">Client Credentials</w:t>
       </w:r>
       <w:r>
-        <w:t xml:space="preserve">, todos retornando os mesmos campos vazios — comprovando o caráter universal da restrição em nível de aplicação, não em nível de usuário ou plano.</w:t>
+        <w:t xml:space="preserve">, todos retornando os mesmos campos vazios, comprovando o caráter universal da restrição em nível de aplicação, não em nível de usuário ou plano.</w:t>
       </w:r>
     </w:p>
     <w:p>
@@ -3788,7 +3782,7 @@
           <w:b/>
           <w:bCs/>
         </w:rPr>
-        <w:t xml:space="preserve">Solução metodológica adotada — fontes externas com mesma metodologia para Input e Output:</w:t>
+        <w:t xml:space="preserve">Solução metodológica adotada, fontes externas com mesma metodologia para Input e Output:</w:t>
       </w:r>
     </w:p>
     <w:p>
@@ -3897,10 +3891,7 @@
         </w:r>
       </w:hyperlink>
       <w:r>
-        <w:t xml:space="preserve"> </w:t>
-      </w:r>
-      <w:r>
-        <w:t xml:space="preserve">— API gratuita que fornece, para cada artista e cada faixa: número de</w:t>
+        <w:t xml:space="preserve">, API gratuita que fornece, para cada artista e cada faixa: número de</w:t>
       </w:r>
       <w:r>
         <w:t xml:space="preserve"> </w:t>
@@ -4014,10 +4005,7 @@
         </w:r>
       </w:hyperlink>
       <w:r>
-        <w:t xml:space="preserve"> </w:t>
-      </w:r>
-      <w:r>
-        <w:t xml:space="preserve">— banco de dados aberto que fornece metadados ricos sobre artistas: gêneros (</w:t>
+        <w:t xml:space="preserve">, banco de dados aberto que fornece metadados ricos sobre artistas: gêneros (</w:t>
       </w:r>
       <w:r>
         <w:rPr>
@@ -4145,7 +4133,7 @@
           <w:b/>
           <w:bCs/>
         </w:rPr>
-        <w:t xml:space="preserve">Tabela 3.1 — Correspondência entre métricas do Spotify e substitutos externos (Last.fm/MusicBrainz)</w:t>
+        <w:t xml:space="preserve">Tabela 3.1, Correspondência entre métricas do Spotify e substitutos externos (Last.fm/MusicBrainz)</w:t>
       </w:r>
     </w:p>
     <w:tbl>
@@ -4473,7 +4461,7 @@
               <w:jc w:val="left"/>
             </w:pPr>
             <w:r>
-              <w:t xml:space="preserve">Ano de início de carreira do artista — métrica nova que separa</w:t>
+              <w:t xml:space="preserve">Ano de início de carreira do artista, métrica nova que separa</w:t>
             </w:r>
             <w:r>
               <w:t xml:space="preserve"> </w:t>
@@ -4561,7 +4549,7 @@
               <w:t xml:space="preserve">Group</w:t>
             </w:r>
             <w:r>
-              <w:t xml:space="preserve">) — métrica nova de estrutura social do consumo.</w:t>
+              <w:t xml:space="preserve">), métrica nova de estrutura social do consumo.</w:t>
             </w:r>
           </w:p>
         </w:tc>
@@ -4669,7 +4657,7 @@
         <w:t xml:space="preserve"> </w:t>
       </w:r>
       <w:r>
-        <w:t xml:space="preserve">do Last.fm). Essa régua única — idêntica para</w:t>
+        <w:t xml:space="preserve">do Last.fm). Essa régua única, idêntica para</w:t>
       </w:r>
       <w:r>
         <w:t xml:space="preserve"> </w:t>
@@ -4698,10 +4686,7 @@
         <w:t xml:space="preserve">output</w:t>
       </w:r>
       <w:r>
-        <w:t xml:space="preserve"> </w:t>
-      </w:r>
-      <w:r>
-        <w:t xml:space="preserve">— aumenta a robustez da classificação a mudanças de fonte e, sobretudo, garante que os</w:t>
+        <w:t xml:space="preserve">, aumenta a robustez da classificação a mudanças de fonte e, sobretudo, garante que os</w:t>
       </w:r>
       <w:r>
         <w:t xml:space="preserve"> </w:t>
@@ -4827,7 +4812,7 @@
         <w:t xml:space="preserve"> </w:t>
       </w:r>
       <w:r>
-        <w:t xml:space="preserve">fontes (Last.fm + MusicBrainz) varia por persona — de 86,7% para Sofia (perfil</w:t>
+        <w:t xml:space="preserve">fontes (Last.fm + MusicBrainz) varia por persona, de 86,7% para Sofia (perfil</w:t>
       </w:r>
       <w:r>
         <w:t xml:space="preserve"> </w:t>
@@ -4853,10 +4838,7 @@
         <w:t xml:space="preserve">output</w:t>
       </w:r>
       <w:r>
-        <w:t xml:space="preserve"> </w:t>
-      </w:r>
-      <w:r>
-        <w:t xml:space="preserve">—, o que constitui, em si, indício do viés de cobertura discutido em §3.4. Os resultados foram persistidos em cache incremental para garantir reprodutibilidade.</w:t>
+        <w:t xml:space="preserve">, o que constitui, em si, indício do viés de cobertura discutido em §3.4. Os resultados foram persistidos em cache incremental para garantir reprodutibilidade.</w:t>
       </w:r>
     </w:p>
     <w:p>
@@ -4874,7 +4856,7 @@
         <w:t xml:space="preserve"> </w:t>
       </w:r>
       <w:r>
-        <w:t xml:space="preserve">o fato de que o próprio instrumental técnico empregado em uma auditoria algorítmica tenha sido sistematicamente obstruído pela plataforma auditada —</w:t>
+        <w:t xml:space="preserve">o fato de que o próprio instrumental técnico empregado em uma auditoria algorítmica tenha sido sistematicamente obstruído pela plataforma auditada,</w:t>
       </w:r>
       <w:r>
         <w:t xml:space="preserve"> </w:t>
@@ -4890,7 +4872,7 @@
         <w:t xml:space="preserve"> </w:t>
       </w:r>
       <w:r>
-        <w:t xml:space="preserve">a execução da pesquisa, sem aviso público no caso da Onda 3 — constitui</w:t>
+        <w:t xml:space="preserve">a execução da pesquisa, sem aviso público no caso da Onda 3, constitui</w:t>
       </w:r>
       <w:r>
         <w:t xml:space="preserve"> </w:t>
@@ -5083,7 +5065,7 @@
         <w:t xml:space="preserve"> </w:t>
       </w:r>
       <w:r>
-        <w:t xml:space="preserve">de execuções por artista — patamares característicos da zona de consagração comercial massiva. O viés de recência (do álbum) é extremo:</w:t>
+        <w:t xml:space="preserve">de execuções por artista, patamares característicos da zona de consagração comercial massiva. O viés de recência (do álbum) é extremo:</w:t>
       </w:r>
       <w:r>
         <w:t xml:space="preserve"> </w:t>
@@ -5184,7 +5166,7 @@
         <w:t xml:space="preserve">Group</w:t>
       </w:r>
       <w:r>
-        <w:t xml:space="preserve">) — composição típica do mainstream brasileiro, onde duplas sertanejas coexistem com solistas pop. A</w:t>
+        <w:t xml:space="preserve">), composição típica do mainstream brasileiro, onde duplas sertanejas coexistem com solistas pop. A</w:t>
       </w:r>
       <w:r>
         <w:t xml:space="preserve"> </w:t>
@@ -5323,7 +5305,7 @@
           <w:b/>
           <w:bCs/>
         </w:rPr>
-        <w:t xml:space="preserve">Tabela 3.2 — Indicadores quantitativos do perfil Beatriz (input)</w:t>
+        <w:t xml:space="preserve">Tabela 3.2, Indicadores quantitativos do perfil Beatriz (input)</w:t>
       </w:r>
     </w:p>
     <w:tbl>
@@ -5526,7 +5508,7 @@
               <w:jc w:val="left"/>
             </w:pPr>
             <w:r>
-              <w:t xml:space="preserve">Escuta horizontal pulverizada — padrão</w:t>
+              <w:t xml:space="preserve">Escuta horizontal pulverizada, padrão</w:t>
             </w:r>
             <w:r>
               <w:t xml:space="preserve"> </w:t>
@@ -5671,7 +5653,7 @@
               <w:jc w:val="left"/>
             </w:pPr>
             <w:r>
-              <w:t xml:space="preserve">Mistura de artistas estabelecidos (sertanejo legacy) com novidades virais — coerente com um perfil</w:t>
+              <w:t xml:space="preserve">Mistura de artistas estabelecidos (sertanejo legacy) com novidades virais, coerente com um perfil</w:t>
             </w:r>
             <w:r>
               <w:t xml:space="preserve"> </w:t>
@@ -5971,7 +5953,7 @@
           <w:b/>
           <w:bCs/>
         </w:rPr>
-        <w:t xml:space="preserve">Figura 3.1 — Beatriz (input): distribuição de listeners por faixa (Last.fm).</w:t>
+        <w:t xml:space="preserve">Figura 3.1, Beatriz (input): distribuição de listeners por faixa (Last.fm).</w:t>
       </w:r>
     </w:p>
     <w:p>
@@ -6034,7 +6016,7 @@
           <w:b/>
           <w:bCs/>
         </w:rPr>
-        <w:t xml:space="preserve">Figura 3.2 — Beatriz (input): distribuição de gêneros (top tags).</w:t>
+        <w:t xml:space="preserve">Figura 3.2, Beatriz (input): distribuição de gêneros (top tags).</w:t>
       </w:r>
     </w:p>
     <w:p>
@@ -6097,7 +6079,7 @@
           <w:b/>
           <w:bCs/>
         </w:rPr>
-        <w:t xml:space="preserve">Figura 3.3 — Beatriz (input): distribuição temporal (era musical das faixas).</w:t>
+        <w:t xml:space="preserve">Figura 3.3, Beatriz (input): distribuição temporal (era musical das faixas).</w:t>
       </w:r>
     </w:p>
     <w:p>
@@ -6160,7 +6142,7 @@
           <w:b/>
           <w:bCs/>
         </w:rPr>
-        <w:t xml:space="preserve">Figura 3.4 — Beatriz (input): concentração de artistas (Curva de Lorenz).</w:t>
+        <w:t xml:space="preserve">Figura 3.4, Beatriz (input): concentração de artistas (Curva de Lorenz).</w:t>
       </w:r>
     </w:p>
     <w:p>
@@ -6223,7 +6205,7 @@
           <w:b/>
           <w:bCs/>
         </w:rPr>
-        <w:t xml:space="preserve">Figura 3.5 — Beatriz (input): popularidade vs. alcance dos artistas.</w:t>
+        <w:t xml:space="preserve">Figura 3.5, Beatriz (input): popularidade vs. alcance dos artistas.</w:t>
       </w:r>
     </w:p>
     <w:p>
@@ -6286,7 +6268,7 @@
           <w:b/>
           <w:bCs/>
         </w:rPr>
-        <w:t xml:space="preserve">Figura 3.6 — Beatriz (input): distribuição de duração das faixas.</w:t>
+        <w:t xml:space="preserve">Figura 3.6, Beatriz (input): distribuição de duração das faixas.</w:t>
       </w:r>
     </w:p>
     <w:bookmarkEnd w:id="49"/>
@@ -6427,7 +6409,7 @@
         <w:t xml:space="preserve"> </w:t>
       </w:r>
       <w:r>
-        <w:t xml:space="preserve">(Last.fm) — patamar característico da Cauda Longa do consumo musical — combinada com uma</w:t>
+        <w:t xml:space="preserve">(Last.fm), patamar característico da Cauda Longa do consumo musical, combinada com uma</w:t>
       </w:r>
       <w:r>
         <w:t xml:space="preserve"> </w:t>
@@ -6615,10 +6597,7 @@
         <w:t xml:space="preserve">bedroom producers</w:t>
       </w:r>
       <w:r>
-        <w:t xml:space="preserve"> </w:t>
-      </w:r>
-      <w:r>
-        <w:t xml:space="preserve">— produtores independentes que operam em isolamento, contribuindo individualmente para o catálogo lo-fi industrial. A</w:t>
+        <w:t xml:space="preserve">, produtores independentes que operam em isolamento, contribuindo individualmente para o catálogo lo-fi industrial. A</w:t>
       </w:r>
       <w:r>
         <w:t xml:space="preserve"> </w:t>
@@ -6664,7 +6643,7 @@
           <w:b/>
           <w:bCs/>
         </w:rPr>
-        <w:t xml:space="preserve">Tabela 3.3 — Indicadores quantitativos do perfil Daniel (input)</w:t>
+        <w:t xml:space="preserve">Tabela 3.3, Indicadores quantitativos do perfil Daniel (input)</w:t>
       </w:r>
     </w:p>
     <w:tbl>
@@ -6912,7 +6891,7 @@
               <w:jc w:val="left"/>
             </w:pPr>
             <w:r>
-              <w:t xml:space="preserve">Pulverização Funcional; indiferença à autoria — o usuário consome o</w:t>
+              <w:t xml:space="preserve">Pulverização Funcional; indiferença à autoria, o usuário consome o</w:t>
             </w:r>
             <w:r>
               <w:t xml:space="preserve"> </w:t>
@@ -7044,7 +7023,7 @@
               <w:jc w:val="left"/>
             </w:pPr>
             <w:r>
-              <w:t xml:space="preserve">Cobertura limitada — muitos produtores lo-fi não têm registro no MusicBrainz; valor com baixa confiabilidade.</w:t>
+              <w:t xml:space="preserve">Cobertura limitada, muitos produtores lo-fi não têm registro no MusicBrainz; valor com baixa confiabilidade.</w:t>
             </w:r>
           </w:p>
         </w:tc>
@@ -7351,7 +7330,7 @@
           <w:b/>
           <w:bCs/>
         </w:rPr>
-        <w:t xml:space="preserve">Figura 3.7 — Daniel (input): distribuição de listeners por faixa (Last.fm).</w:t>
+        <w:t xml:space="preserve">Figura 3.7, Daniel (input): distribuição de listeners por faixa (Last.fm).</w:t>
       </w:r>
     </w:p>
     <w:p>
@@ -7414,7 +7393,7 @@
           <w:b/>
           <w:bCs/>
         </w:rPr>
-        <w:t xml:space="preserve">Figura 3.8 — Daniel (input): distribuição de gêneros (top tags).</w:t>
+        <w:t xml:space="preserve">Figura 3.8, Daniel (input): distribuição de gêneros (top tags).</w:t>
       </w:r>
     </w:p>
     <w:p>
@@ -7477,7 +7456,7 @@
           <w:b/>
           <w:bCs/>
         </w:rPr>
-        <w:t xml:space="preserve">Figura 3.9 — Daniel (input): distribuição temporal (era musical das faixas).</w:t>
+        <w:t xml:space="preserve">Figura 3.9, Daniel (input): distribuição temporal (era musical das faixas).</w:t>
       </w:r>
     </w:p>
     <w:p>
@@ -7540,7 +7519,7 @@
           <w:b/>
           <w:bCs/>
         </w:rPr>
-        <w:t xml:space="preserve">Figura 3.10 — Daniel (input): concentração de artistas (Curva de Lorenz).</w:t>
+        <w:t xml:space="preserve">Figura 3.10, Daniel (input): concentração de artistas (Curva de Lorenz).</w:t>
       </w:r>
     </w:p>
     <w:p>
@@ -7603,7 +7582,7 @@
           <w:b/>
           <w:bCs/>
         </w:rPr>
-        <w:t xml:space="preserve">Figura 3.11 — Daniel (input): popularidade vs. alcance dos artistas.</w:t>
+        <w:t xml:space="preserve">Figura 3.11, Daniel (input): popularidade vs. alcance dos artistas.</w:t>
       </w:r>
     </w:p>
     <w:p>
@@ -7666,7 +7645,7 @@
           <w:b/>
           <w:bCs/>
         </w:rPr>
-        <w:t xml:space="preserve">Figura 3.12 — Daniel (input): distribuição de duração das faixas.</w:t>
+        <w:t xml:space="preserve">Figura 3.12, Daniel (input): distribuição de duração das faixas.</w:t>
       </w:r>
     </w:p>
     <w:bookmarkEnd w:id="70"/>
@@ -7786,10 +7765,7 @@
         <w:t xml:space="preserve">A Mediana de Listeners por Track no Last.fm é de apenas 1,223</w:t>
       </w:r>
       <w:r>
-        <w:t xml:space="preserve"> </w:t>
-      </w:r>
-      <w:r>
-        <w:t xml:space="preserve">— três ordens de magnitude abaixo de Beatriz (51.879) e quase 16 vezes menor que Daniel — evidenciando que a grande maioria de seu consumo reside na obscuridade quase total do catálogo global. A Mediana de Listeners por Artista (59,042) também é a mais baixa do estudo, validando seu interesse pelo cenário independente.</w:t>
+        <w:t xml:space="preserve">, três ordens de magnitude abaixo de Beatriz (51.879) e quase 16 vezes menor que Daniel, evidenciando que a grande maioria de seu consumo reside na obscuridade quase total do catálogo global. A Mediana de Listeners por Artista (59,042) também é a mais baixa do estudo, validando seu interesse pelo cenário independente.</w:t>
       </w:r>
     </w:p>
     <w:p>
@@ -7821,7 +7797,7 @@
         <w:pStyle w:val="BodyText"/>
       </w:pPr>
       <w:r>
-        <w:t xml:space="preserve">Temporalmente, ela compartilha o viés de contemporaneidade (Ano Médio 2021, com 77% das faixas na década de 2020), mas com um propósito diferente: ela busca a vanguarda experimental atual, não os sucessos de rádio. A distribuição de tags valida sua formação em design e gosto por atmosferas: há predominância de estilos baseados em textura e colagem sonora —</w:t>
+        <w:t xml:space="preserve">Temporalmente, ela compartilha o viés de contemporaneidade (Ano Médio 2021, com 77% das faixas na década de 2020), mas com um propósito diferente: ela busca a vanguarda experimental atual, não os sucessos de rádio. A distribuição de tags valida sua formação em design e gosto por atmosferas: há predominância de estilos baseados em textura e colagem sonora,</w:t>
       </w:r>
       <w:r>
         <w:t xml:space="preserve"> </w:t>
@@ -7881,10 +7857,7 @@
         <w:t xml:space="preserve">lo-fi indie</w:t>
       </w:r>
       <w:r>
-        <w:t xml:space="preserve"> </w:t>
-      </w:r>
-      <w:r>
-        <w:t xml:space="preserve">— gêneros complexos que exigem análise de conteúdo de áudio (timbre/ritmo) mais apurada do que a simples filtragem colaborativa. A composição</w:t>
+        <w:t xml:space="preserve">, gêneros complexos que exigem análise de conteúdo de áudio (timbre/ritmo) mais apurada do que a simples filtragem colaborativa. A composição</w:t>
       </w:r>
       <w:r>
         <w:t xml:space="preserve"> </w:t>
@@ -7930,7 +7903,7 @@
           <w:b/>
           <w:bCs/>
         </w:rPr>
-        <w:t xml:space="preserve">Tabela 3.4 — Indicadores quantitativos do perfil Sofia (input)</w:t>
+        <w:t xml:space="preserve">Tabela 3.4, Indicadores quantitativos do perfil Sofia (input)</w:t>
       </w:r>
     </w:p>
     <w:tbl>
@@ -8236,7 +8209,7 @@
               <w:jc w:val="left"/>
             </w:pPr>
             <w:r>
-              <w:t xml:space="preserve">Escuta focada em discografia profunda —</w:t>
+              <w:t xml:space="preserve">Escuta focada em discografia profunda,</w:t>
             </w:r>
             <w:r>
               <w:t xml:space="preserve"> </w:t>
@@ -8325,7 +8298,7 @@
               <w:jc w:val="left"/>
             </w:pPr>
             <w:r>
-              <w:t xml:space="preserve">Predominância de projetos individuais — característico de cenas independentes.</w:t>
+              <w:t xml:space="preserve">Predominância de projetos individuais, característico de cenas independentes.</w:t>
             </w:r>
           </w:p>
         </w:tc>
@@ -8562,7 +8535,7 @@
           <w:b/>
           <w:bCs/>
         </w:rPr>
-        <w:t xml:space="preserve">Figura 3.13 — Sofia (input): distribuição de listeners por faixa (Last.fm).</w:t>
+        <w:t xml:space="preserve">Figura 3.13, Sofia (input): distribuição de listeners por faixa (Last.fm).</w:t>
       </w:r>
     </w:p>
     <w:p>
@@ -8625,7 +8598,7 @@
           <w:b/>
           <w:bCs/>
         </w:rPr>
-        <w:t xml:space="preserve">Figura 3.14 — Sofia (input): distribuição de gêneros (top tags).</w:t>
+        <w:t xml:space="preserve">Figura 3.14, Sofia (input): distribuição de gêneros (top tags).</w:t>
       </w:r>
     </w:p>
     <w:p>
@@ -8688,7 +8661,7 @@
           <w:b/>
           <w:bCs/>
         </w:rPr>
-        <w:t xml:space="preserve">Figura 3.15 — Sofia (input): distribuição temporal (era musical das faixas).</w:t>
+        <w:t xml:space="preserve">Figura 3.15, Sofia (input): distribuição temporal (era musical das faixas).</w:t>
       </w:r>
     </w:p>
     <w:p>
@@ -8751,7 +8724,7 @@
           <w:b/>
           <w:bCs/>
         </w:rPr>
-        <w:t xml:space="preserve">Figura 3.16 — Sofia (input): concentração de artistas (Curva de Lorenz).</w:t>
+        <w:t xml:space="preserve">Figura 3.16, Sofia (input): concentração de artistas (Curva de Lorenz).</w:t>
       </w:r>
     </w:p>
     <w:p>
@@ -8814,7 +8787,7 @@
           <w:b/>
           <w:bCs/>
         </w:rPr>
-        <w:t xml:space="preserve">Figura 3.17 — Sofia (input): popularidade vs. alcance dos artistas.</w:t>
+        <w:t xml:space="preserve">Figura 3.17, Sofia (input): popularidade vs. alcance dos artistas.</w:t>
       </w:r>
     </w:p>
     <w:p>
@@ -8877,7 +8850,7 @@
           <w:b/>
           <w:bCs/>
         </w:rPr>
-        <w:t xml:space="preserve">Figura 3.18 — Sofia (input): distribuição de duração das faixas.</w:t>
+        <w:t xml:space="preserve">Figura 3.18, Sofia (input): distribuição de duração das faixas.</w:t>
       </w:r>
     </w:p>
     <w:bookmarkEnd w:id="91"/>
@@ -9066,10 +9039,7 @@
         <w:t xml:space="preserve">Mediana de Listeners por Artista mais alta do estudo</w:t>
       </w:r>
       <w:r>
-        <w:t xml:space="preserve"> </w:t>
-      </w:r>
-      <w:r>
-        <w:t xml:space="preserve">—</w:t>
+        <w:t xml:space="preserve">,</w:t>
       </w:r>
       <w:r>
         <w:t xml:space="preserve"> </w:t>
@@ -9085,7 +9055,7 @@
         <w:t xml:space="preserve"> </w:t>
       </w:r>
       <w:r>
-        <w:t xml:space="preserve">no Last.fm — e uma</w:t>
+        <w:t xml:space="preserve">no Last.fm, e uma</w:t>
       </w:r>
       <w:r>
         <w:t xml:space="preserve"> </w:t>
@@ -9203,7 +9173,7 @@
         <w:t xml:space="preserve"> </w:t>
       </w:r>
       <w:r>
-        <w:t xml:space="preserve">(mínimo de desigualdade — todos os 18 artistas têm peso comparável). Isso confirma que ele não consome apenas os</w:t>
+        <w:t xml:space="preserve">(mínimo de desigualdade, todos os 18 artistas têm peso comparável). Isso confirma que ele não consome apenas os</w:t>
       </w:r>
       <w:r>
         <w:t xml:space="preserve"> </w:t>
@@ -9240,7 +9210,7 @@
         <w:t xml:space="preserve"> </w:t>
       </w:r>
       <w:r>
-        <w:t xml:space="preserve">(cobertura 100% — todos os 18 artistas têm registro completo) confirma com</w:t>
+        <w:t xml:space="preserve">(cobertura 100%, todos os 18 artistas têm registro completo) confirma com</w:t>
       </w:r>
       <w:r>
         <w:t xml:space="preserve"> </w:t>
@@ -9327,7 +9297,7 @@
           <w:b/>
           <w:bCs/>
         </w:rPr>
-        <w:t xml:space="preserve">Tabela 3.5 — Indicadores quantitativos do perfil Ricardo (input)</w:t>
+        <w:t xml:space="preserve">Tabela 3.5, Indicadores quantitativos do perfil Ricardo (input)</w:t>
       </w:r>
     </w:p>
     <w:tbl>
@@ -9462,7 +9432,7 @@
               <w:jc w:val="left"/>
             </w:pPr>
             <w:r>
-              <w:t xml:space="preserve">Histórico cumulativo enorme — décadas de plays acumulados. Validação canônica plena.</w:t>
+              <w:t xml:space="preserve">Histórico cumulativo enorme, décadas de plays acumulados. Validação canônica plena.</w:t>
             </w:r>
           </w:p>
         </w:tc>
@@ -9600,7 +9570,7 @@
               <w:jc w:val="left"/>
             </w:pPr>
             <w:r>
-              <w:t xml:space="preserve">Distribuição quase uniforme entre os 18 artistas — todos com 8-16 faixas.</w:t>
+              <w:t xml:space="preserve">Distribuição quase uniforme entre os 18 artistas, todos com 8-16 faixas.</w:t>
             </w:r>
           </w:p>
         </w:tc>
@@ -9642,7 +9612,7 @@
               <w:jc w:val="left"/>
             </w:pPr>
             <w:r>
-              <w:t xml:space="preserve">Album-Oriented Rock — escuta de discografia, não de playlist.</w:t>
+              <w:t xml:space="preserve">Album-Oriented Rock, escuta de discografia, não de playlist.</w:t>
             </w:r>
           </w:p>
         </w:tc>
@@ -9979,7 +9949,7 @@
           <w:b/>
           <w:bCs/>
         </w:rPr>
-        <w:t xml:space="preserve">Figura 3.19 — Ricardo (input): distribuição de listeners por faixa (Last.fm).</w:t>
+        <w:t xml:space="preserve">Figura 3.19, Ricardo (input): distribuição de listeners por faixa (Last.fm).</w:t>
       </w:r>
     </w:p>
     <w:p>
@@ -10042,7 +10012,7 @@
           <w:b/>
           <w:bCs/>
         </w:rPr>
-        <w:t xml:space="preserve">Figura 3.20 — Ricardo (input): distribuição de gêneros (top tags).</w:t>
+        <w:t xml:space="preserve">Figura 3.20, Ricardo (input): distribuição de gêneros (top tags).</w:t>
       </w:r>
     </w:p>
     <w:p>
@@ -10105,7 +10075,7 @@
           <w:b/>
           <w:bCs/>
         </w:rPr>
-        <w:t xml:space="preserve">Figura 3.21 — Ricardo (input): distribuição temporal (era musical das faixas).</w:t>
+        <w:t xml:space="preserve">Figura 3.21, Ricardo (input): distribuição temporal (era musical das faixas).</w:t>
       </w:r>
     </w:p>
     <w:p>
@@ -10168,7 +10138,7 @@
           <w:b/>
           <w:bCs/>
         </w:rPr>
-        <w:t xml:space="preserve">Figura 3.22 — Ricardo (input): concentração de artistas (Curva de Lorenz).</w:t>
+        <w:t xml:space="preserve">Figura 3.22, Ricardo (input): concentração de artistas (Curva de Lorenz).</w:t>
       </w:r>
     </w:p>
     <w:p>
@@ -10231,7 +10201,7 @@
           <w:b/>
           <w:bCs/>
         </w:rPr>
-        <w:t xml:space="preserve">Figura 3.23 — Ricardo (input): popularidade vs. alcance dos artistas.</w:t>
+        <w:t xml:space="preserve">Figura 3.23, Ricardo (input): popularidade vs. alcance dos artistas.</w:t>
       </w:r>
     </w:p>
     <w:p>
@@ -10294,7 +10264,7 @@
           <w:b/>
           <w:bCs/>
         </w:rPr>
-        <w:t xml:space="preserve">Figura 3.24 — Ricardo (input): distribuição de duração das faixas.</w:t>
+        <w:t xml:space="preserve">Figura 3.24, Ricardo (input): distribuição de duração das faixas.</w:t>
       </w:r>
     </w:p>
     <w:bookmarkEnd w:id="112"/>
@@ -10419,7 +10389,7 @@
         <w:t xml:space="preserve">Outputs</w:t>
       </w:r>
       <w:r>
-        <w:t xml:space="preserve">) — seja de conteúdo, de tema ou de magnitude de diversidade — poderá ser atribuída à interferência do algoritmo, e não à similaridade original dos usuários.</w:t>
+        <w:t xml:space="preserve">), seja de conteúdo, de tema ou de magnitude de diversidade, poderá ser atribuída à interferência do algoritmo, e não à similaridade original dos usuários.</w:t>
       </w:r>
     </w:p>
     <w:bookmarkStart w:id="115" w:name="X743f7c5cd09027308b5074dde7b99e99dca2485"/>
@@ -10566,7 +10536,7 @@
           <w:b/>
           <w:bCs/>
         </w:rPr>
-        <w:t xml:space="preserve">Tabela 3.6 — Métricas de diversidade dos inputs (Shannon, Pielou, Gini, riqueza)</w:t>
+        <w:t xml:space="preserve">Tabela 3.6, Métricas de diversidade dos inputs (Shannon, Pielou, Gini, riqueza)</w:t>
       </w:r>
     </w:p>
     <w:tbl>
@@ -10973,7 +10943,7 @@
               <w:t xml:space="preserve"> </w:t>
             </w:r>
             <w:r>
-              <w:t xml:space="preserve">de concentração — a evenness de Pielou (0,98) e o Gini mínimo (0,18) mostram que os 18 artistas têm peso quase idêntico.</w:t>
+              <w:t xml:space="preserve">de concentração, a evenness de Pielou (0,98) e o Gini mínimo (0,18) mostram que os 18 artistas têm peso quase idêntico.</w:t>
             </w:r>
           </w:p>
         </w:tc>
@@ -11148,7 +11118,7 @@
         <w:t xml:space="preserve"> </w:t>
       </w:r>
       <w:r>
-        <w:t xml:space="preserve">artistas (18), não porque os distribui de forma desigual — ao contrário, sua distribuição é a mais uniforme do estudo. Essa distinção entre riqueza e uniformidade é central para a leitura correta do Capítulo 4, onde se demonstra que a</w:t>
+        <w:t xml:space="preserve">artistas (18), não porque os distribui de forma desigual, ao contrário, sua distribuição é a mais uniforme do estudo. Essa distinção entre riqueza e uniformidade é central para a leitura correta do Capítulo 4, onde se demonstra que a</w:t>
       </w:r>
       <w:r>
         <w:t xml:space="preserve"> </w:t>
@@ -11363,10 +11333,7 @@
         <w:t xml:space="preserve">régua única</w:t>
       </w:r>
       <w:r>
-        <w:t xml:space="preserve"> </w:t>
-      </w:r>
-      <w:r>
-        <w:t xml:space="preserve">— idêntica para</w:t>
+        <w:t xml:space="preserve">, idêntica para</w:t>
       </w:r>
       <w:r>
         <w:t xml:space="preserve"> </w:t>
@@ -11395,10 +11362,7 @@
         <w:t xml:space="preserve">output</w:t>
       </w:r>
       <w:r>
-        <w:t xml:space="preserve"> </w:t>
-      </w:r>
-      <w:r>
-        <w:t xml:space="preserve">— substitui os limiares absolutos baseados em</w:t>
+        <w:t xml:space="preserve">, substitui os limiares absolutos baseados em</w:t>
       </w:r>
       <w:r>
         <w:t xml:space="preserve"> </w:t>
@@ -11458,7 +11422,7 @@
           <w:b/>
           <w:bCs/>
         </w:rPr>
-        <w:t xml:space="preserve">Tabela 3.7 — Distribuição de Cauda Longa dos inputs (régua única de listeners)</w:t>
+        <w:t xml:space="preserve">Tabela 3.7, Distribuição de Cauda Longa dos inputs (régua única de listeners)</w:t>
       </w:r>
     </w:p>
     <w:tbl>
@@ -12054,7 +12018,7 @@
           <w:b/>
           <w:bCs/>
         </w:rPr>
-        <w:t xml:space="preserve">Figura 3.25 — Matriz de Similaridade (Índice de Jaccard) entre as personas (input).</w:t>
+        <w:t xml:space="preserve">Figura 3.25, Matriz de Similaridade (Índice de Jaccard) entre as personas (input).</w:t>
       </w:r>
     </w:p>
     <w:p>
@@ -12195,7 +12159,7 @@
           <w:b/>
           <w:bCs/>
         </w:rPr>
-        <w:t xml:space="preserve">Figura 3.26 — Mapeamento da Economia da Atenção: popularidade vs. alcance, por persona (input).</w:t>
+        <w:t xml:space="preserve">Figura 3.26, Mapeamento da Economia da Atenção: popularidade vs. alcance, por persona (input).</w:t>
       </w:r>
     </w:p>
     <w:p>
@@ -12308,7 +12272,7 @@
           <w:b/>
           <w:bCs/>
         </w:rPr>
-        <w:t xml:space="preserve">Figura 3.27 — Cronologia do consumo: distribuição temporal das faixas por persona (KDE, input).</w:t>
+        <w:t xml:space="preserve">Figura 3.27, Cronologia do consumo: distribuição temporal das faixas por persona (KDE, input).</w:t>
       </w:r>
     </w:p>
     <w:p>
@@ -12389,7 +12353,7 @@
           <w:b/>
           <w:bCs/>
         </w:rPr>
-        <w:t xml:space="preserve">Figura 3.28 — Concentração de artistas: Curva de Lorenz comparada entre personas (input).</w:t>
+        <w:t xml:space="preserve">Figura 3.28, Concentração de artistas: Curva de Lorenz comparada entre personas (input).</w:t>
       </w:r>
     </w:p>
     <w:bookmarkEnd w:id="129"/>
@@ -12433,7 +12397,7 @@
         <w:t xml:space="preserve"> </w:t>
       </w:r>
       <w:r>
-        <w:t xml:space="preserve">confirma que as quatro personas sintéticas — Beatriz, Daniel, Sofia e Ricardo — constituem instrumentos de medição calibrados, representando vetores de comportamento distintos e isolados.</w:t>
+        <w:t xml:space="preserve">confirma que as quatro personas sintéticas, Beatriz, Daniel, Sofia e Ricardo, constituem instrumentos de medição calibrados, representando vetores de comportamento distintos e isolados.</w:t>
       </w:r>
     </w:p>
     <w:p>
@@ -12730,7 +12694,7 @@
         <w:t xml:space="preserve"> </w:t>
       </w:r>
       <w:r>
-        <w:t xml:space="preserve">por conta-persona — totalizando ~160 horas de incubação somadas. A escolha do</w:t>
+        <w:t xml:space="preserve">por conta-persona, totalizando ~160 horas de incubação somadas. A escolha do</w:t>
       </w:r>
       <w:r>
         <w:t xml:space="preserve"> </w:t>
@@ -12828,7 +12792,7 @@
         <w:tab/>
       </w:r>
       <w:r>
-        <w:t xml:space="preserve">B) Achado Central — Obstrução Progressiva da API como Meta-Evidência</w:t>
+        <w:t xml:space="preserve">B) Achado Central: Obstrução Progressiva da API como Meta-Evidência</w:t>
       </w:r>
     </w:p>
     <w:p>
@@ -13174,7 +13138,7 @@
         <w:tab/>
       </w:r>
       <w:r>
-        <w:t xml:space="preserve">C) Resposta Metodológica — Apples-to-Apples via Fontes Externas</w:t>
+        <w:t xml:space="preserve">C) Resposta Metodológica: Apples-to-Apples via Fontes Externas</w:t>
       </w:r>
     </w:p>
     <w:p>
@@ -13211,7 +13175,7 @@
         <w:t xml:space="preserve"> </w:t>
       </w:r>
       <w:r>
-        <w:t xml:space="preserve">(Last.fm + MusicBrainz), aplicadas consistentemente aos dois lados da auditoria. Esta solução transforma a limitação em oportunidade — a pesquisa passa a se ancorar em três bases de dados independentes (Spotify para</w:t>
+        <w:t xml:space="preserve">(Last.fm + MusicBrainz), aplicadas consistentemente aos dois lados da auditoria. Esta solução transforma a limitação em oportunidade, a pesquisa passa a se ancorar em três bases de dados independentes (Spotify para</w:t>
       </w:r>
       <w:r>
         <w:t xml:space="preserve"> </w:t>
@@ -13277,7 +13241,7 @@
         <w:t xml:space="preserve"> </w:t>
       </w:r>
       <w:r>
-        <w:t xml:space="preserve">(Sofia) — fato que dialoga com o viés de cobertura geocultural discutido a seguir. Os limiares de classificação em Cauda Longa foram</w:t>
+        <w:t xml:space="preserve">(Sofia), fato que dialoga com o viés de cobertura geocultural discutido a seguir. Os limiares de classificação em Cauda Longa foram</w:t>
       </w:r>
       <w:r>
         <w:t xml:space="preserve"> </w:t>
@@ -13842,7 +13806,7 @@
         <w:t xml:space="preserve"> </w:t>
       </w:r>
       <w:r>
-        <w:t xml:space="preserve">algorítmicos coletados — as faixas que o Spotify recomendou aos quatro perfis sintéticos por meio dos</w:t>
+        <w:t xml:space="preserve">algorítmicos coletados, as faixas que o Spotify recomendou aos quatro perfis sintéticos por meio dos</w:t>
       </w:r>
       <w:r>
         <w:t xml:space="preserve"> </w:t>
@@ -13889,7 +13853,7 @@
         <w:t xml:space="preserve"> </w:t>
       </w:r>
       <w:r>
-        <w:t xml:space="preserve">coletados; (ii) cálculo da Taxa de Overlap Interno (redundância dentro da bolha de cada persona); (iii) análise do Delta Algorítmico — comparação direta</w:t>
+        <w:t xml:space="preserve">coletados; (ii) cálculo da Taxa de Overlap Interno (redundância dentro da bolha de cada persona); (iii) análise do Delta Algorítmico, comparação direta</w:t>
       </w:r>
       <w:r>
         <w:t xml:space="preserve"> </w:t>
@@ -13960,7 +13924,7 @@
         <w:t xml:space="preserve"> </w:t>
       </w:r>
       <w:r>
-        <w:t xml:space="preserve">para cada conta. Estas playlists foram copiadas manualmente para playlists espelho de propriedade de cada persona —</w:t>
+        <w:t xml:space="preserve">para cada conta. Estas playlists foram copiadas manualmente para playlists espelho de propriedade de cada persona,</w:t>
       </w:r>
       <w:r>
         <w:t xml:space="preserve"> </w:t>
@@ -14012,7 +13976,7 @@
           <w:b/>
           <w:bCs/>
         </w:rPr>
-        <w:t xml:space="preserve">Tabela 4.1 — Volume e cobertura dos Outputs</w:t>
+        <w:t xml:space="preserve">Tabela 4.1, Volume e cobertura dos Outputs</w:t>
       </w:r>
     </w:p>
     <w:tbl>
@@ -14451,7 +14415,7 @@
         <w:t xml:space="preserve"> </w:t>
       </w:r>
       <w:r>
-        <w:t xml:space="preserve">(200 faixas) — efeito direto dos seis</w:t>
+        <w:t xml:space="preserve">(200 faixas), efeito direto dos seis</w:t>
       </w:r>
       <w:r>
         <w:t xml:space="preserve"> </w:t>
@@ -14515,7 +14479,7 @@
         <w:t xml:space="preserve"> </w:t>
       </w:r>
       <w:r>
-        <w:t xml:space="preserve">no MusicBrainz — viés de cobertura discutido em §3.4.</w:t>
+        <w:t xml:space="preserve">no MusicBrainz, viés de cobertura discutido em §3.4.</w:t>
       </w:r>
     </w:p>
     <w:bookmarkEnd w:id="138"/>
@@ -14661,7 +14625,7 @@
         <w:t xml:space="preserve"> </w:t>
       </w:r>
       <w:r>
-        <w:t xml:space="preserve">× 50 faixas). Quanto maior a taxa, mais redundante é o conjunto de clusters — sinal de uma</w:t>
+        <w:t xml:space="preserve">× 50 faixas). Quanto maior a taxa, mais redundante é o conjunto de clusters, sinal de uma</w:t>
       </w:r>
       <w:r>
         <w:t xml:space="preserve"> </w:t>
@@ -14685,7 +14649,7 @@
           <w:b/>
           <w:bCs/>
         </w:rPr>
-        <w:t xml:space="preserve">Tabela 4.2 — Taxa de Overlap Interno entre os Daily Mixes</w:t>
+        <w:t xml:space="preserve">Tabela 4.2, Taxa de Overlap Interno entre os Daily Mixes</w:t>
       </w:r>
     </w:p>
     <w:tbl>
@@ -15050,10 +15014,7 @@
               <w:t xml:space="preserve">Maior redundância</w:t>
             </w:r>
             <w:r>
-              <w:t xml:space="preserve"> </w:t>
-            </w:r>
-            <w:r>
-              <w:t xml:space="preserve">— bolha mais estreita</w:t>
+              <w:t xml:space="preserve">, bolha mais estreita</w:t>
             </w:r>
           </w:p>
         </w:tc>
@@ -15132,7 +15093,7 @@
         <w:t xml:space="preserve">indicador exploratório, e não como achado consolidado</w:t>
       </w:r>
       <w:r>
-        <w:t xml:space="preserve">, por duas limitações estruturais: (i) a métrica é uma transformação determinística e decrescente do número de faixas únicas — fixado o pool em 300,</w:t>
+        <w:t xml:space="preserve">, por duas limitações estruturais: (i) a métrica é uma transformação determinística e decrescente do número de faixas únicas, fixado o pool em 300,</w:t>
       </w:r>
       <w:r>
         <w:t xml:space="preserve"> </w:t>
@@ -15250,7 +15211,7 @@
         <w:tab/>
       </w:r>
       <w:r>
-        <w:t xml:space="preserve">4.3 O Delta Algorítmico — Visão Geral</w:t>
+        <w:t xml:space="preserve">4.3 O Delta Algorítmico: Visão Geral</w:t>
       </w:r>
     </w:p>
     <w:p>
@@ -15389,7 +15350,7 @@
           <w:b/>
           <w:bCs/>
         </w:rPr>
-        <w:t xml:space="preserve">Figura 4.1 — Heatmap do Delta Algorítmico Percentual.</w:t>
+        <w:t xml:space="preserve">Figura 4.1, Heatmap do Delta Algorítmico Percentual.</w:t>
       </w:r>
       <w:r>
         <w:t xml:space="preserve"> </w:t>
@@ -15456,7 +15417,7 @@
           <w:b/>
           <w:bCs/>
         </w:rPr>
-        <w:t xml:space="preserve">Tabela 4.3 — Delta Algorítmico Percentual (Input → Output)</w:t>
+        <w:t xml:space="preserve">Tabela 4.3, Delta Algorítmico Percentual (Input → Output)</w:t>
       </w:r>
     </w:p>
     <w:tbl>
@@ -16437,7 +16398,7 @@
         <w:t xml:space="preserve"> </w:t>
       </w:r>
       <w:r>
-        <w:t xml:space="preserve">[146.972; 221.535] — sem sobreposição; Sofia, listeners/track 1.223 → 6.178 (</w:t>
+        <w:t xml:space="preserve">[146.972; 221.535], sem sobreposição; Sofia, listeners/track 1.223 → 6.178 (</w:t>
       </w:r>
       <w:r>
         <w:rPr>
@@ -16564,7 +16525,7 @@
         <w:tab/>
       </w:r>
       <w:r>
-        <w:t xml:space="preserve">4.4.1 Beatriz (Mainstream) — O Grupo de Controle Validado</w:t>
+        <w:t xml:space="preserve">4.4.1 Beatriz (Mainstream): O Grupo de Controle Validado</w:t>
       </w:r>
     </w:p>
     <w:p>
@@ -16572,7 +16533,7 @@
         <w:pStyle w:val="FirstParagraph"/>
       </w:pPr>
       <w:r>
-        <w:t xml:space="preserve">A persona Beatriz, projetada como controle mainstream brasileiro, exibe os menores deltas entre as quatro personas. As métricas críticas variam dentro de margens estreitas: Shannon entropy +7.9%, listeners por artista +6.3%, percentuais de tipo de artista praticamente inalterados (variação &lt;3%). A Figura 4.2 (KDE de listeners por artista) mostra que as duas distribuições —</w:t>
+        <w:t xml:space="preserve">A persona Beatriz, projetada como controle mainstream brasileiro, exibe os menores deltas entre as quatro personas. As métricas críticas variam dentro de margens estreitas: Shannon entropy +7.9%, listeners por artista +6.3%, percentuais de tipo de artista praticamente inalterados (variação &lt;3%). A Figura 4.2 (KDE de listeners por artista) mostra que as duas distribuições,</w:t>
       </w:r>
       <w:r>
         <w:t xml:space="preserve"> </w:t>
@@ -16601,10 +16562,7 @@
         <w:t xml:space="preserve">output</w:t>
       </w:r>
       <w:r>
-        <w:t xml:space="preserve"> </w:t>
-      </w:r>
-      <w:r>
-        <w:t xml:space="preserve">— quase se sobrepõem para Beatriz, com leve deslocamento à direita no</w:t>
+        <w:t xml:space="preserve">, quase se sobrepõem para Beatriz, com leve deslocamento à direita no</w:t>
       </w:r>
       <w:r>
         <w:t xml:space="preserve"> </w:t>
@@ -16684,7 +16642,7 @@
           <w:b/>
           <w:bCs/>
         </w:rPr>
-        <w:t xml:space="preserve">Figura 4.2 — Distribuição de Listeners por Artista (Last.fm), em escala logarítmica.</w:t>
+        <w:t xml:space="preserve">Figura 4.2, Distribuição de Listeners por Artista (Last.fm), em escala logarítmica.</w:t>
       </w:r>
       <w:r>
         <w:t xml:space="preserve"> </w:t>
@@ -16769,10 +16727,7 @@
         <w:t xml:space="preserve">“comportou-se bem”</w:t>
       </w:r>
       <w:r>
-        <w:t xml:space="preserve"> </w:t>
-      </w:r>
-      <w:r>
-        <w:t xml:space="preserve">— não há distorção significativa do perfil declarado.</w:t>
+        <w:t xml:space="preserve">, não há distorção significativa do perfil declarado.</w:t>
       </w:r>
       <w:r>
         <w:t xml:space="preserve"> </w:t>
@@ -16817,7 +16772,7 @@
         <w:tab/>
       </w:r>
       <w:r>
-        <w:t xml:space="preserve">4.4.2 Daniel (Lo-fi) — Confirmação do Viés de Popularidade</w:t>
+        <w:t xml:space="preserve">4.4.2 Daniel (Lo-fi): Confirmação do Viés de Popularidade</w:t>
       </w:r>
     </w:p>
     <w:p>
@@ -16947,7 +16902,7 @@
           <w:b/>
           <w:bCs/>
         </w:rPr>
-        <w:t xml:space="preserve">Figura 4.3 — Mediana de Listeners por Artista, em escala logarítmica.</w:t>
+        <w:t xml:space="preserve">Figura 4.3, Mediana de Listeners por Artista, em escala logarítmica.</w:t>
       </w:r>
       <w:r>
         <w:t xml:space="preserve"> </w:t>
@@ -17028,7 +16983,7 @@
           <w:b/>
           <w:bCs/>
         </w:rPr>
-        <w:t xml:space="preserve">Figura 4.4 — Distribuição percentual de Solo (Person) vs Grupo (Group) entre artistas únicos.</w:t>
+        <w:t xml:space="preserve">Figura 4.4, Distribuição percentual de Solo (Person) vs Grupo (Group) entre artistas únicos.</w:t>
       </w:r>
       <w:r>
         <w:t xml:space="preserve"> </w:t>
@@ -17316,10 +17271,7 @@
         <w:t xml:space="preserve">artistas mais conhecidos dentro do nicho lo-fi/instrumental</w:t>
       </w:r>
       <w:r>
-        <w:t xml:space="preserve"> </w:t>
-      </w:r>
-      <w:r>
-        <w:t xml:space="preserve">— produtores que migraram do anonimato para a</w:t>
+        <w:t xml:space="preserve">, produtores que migraram do anonimato para a</w:t>
       </w:r>
       <w:r>
         <w:t xml:space="preserve"> </w:t>
@@ -17391,7 +17343,7 @@
         <w:tab/>
       </w:r>
       <w:r>
-        <w:t xml:space="preserve">4.4.3 Sofia (Nicho) — Viés do Hit dentro da Cauda Longa</w:t>
+        <w:t xml:space="preserve">4.4.3 Sofia (Nicho): Viés do Hit dentro da Cauda Longa</w:t>
       </w:r>
     </w:p>
     <w:p>
@@ -17861,7 +17813,7 @@
           <w:b/>
           <w:bCs/>
         </w:rPr>
-        <w:t xml:space="preserve">Figura 4.5 — Distribuição temporal das faixas por persona (KDE, sobreposição Input/Output).</w:t>
+        <w:t xml:space="preserve">Figura 4.5, Distribuição temporal das faixas por persona (KDE, sobreposição Input/Output).</w:t>
       </w:r>
       <w:r>
         <w:t xml:space="preserve"> </w:t>
@@ -17898,7 +17850,7 @@
         <w:t xml:space="preserve">fragmentou o consumo profundo de Sofia</w:t>
       </w:r>
       <w:r>
-        <w:t xml:space="preserve">: em vez de deixá-la imersa em discografias completas (S.Maharba, Eterna, Patch+, com 15+ faixas cada no input), abriu o leque para artistas adicionais com poucas faixas cada — comportamento típico de</w:t>
+        <w:t xml:space="preserve">: em vez de deixá-la imersa em discografias completas (S.Maharba, Eterna, Patch+, com 15+ faixas cada no input), abriu o leque para artistas adicionais com poucas faixas cada, comportamento típico de</w:t>
       </w:r>
       <w:r>
         <w:t xml:space="preserve"> </w:t>
@@ -18028,10 +17980,7 @@
         <w:t xml:space="preserve">faixa</w:t>
       </w:r>
       <w:r>
-        <w:t xml:space="preserve"> </w:t>
-      </w:r>
-      <w:r>
-        <w:t xml:space="preserve">— uma forma mais sutil de viés que apenas a granularidade</w:t>
+        <w:t xml:space="preserve">, uma forma mais sutil de viés que apenas a granularidade</w:t>
       </w:r>
       <w:r>
         <w:t xml:space="preserve"> </w:t>
@@ -18066,7 +18015,7 @@
         <w:tab/>
       </w:r>
       <w:r>
-        <w:t xml:space="preserve">4.4.4 Ricardo (Nostálgico) — Pulverização da Fidelidade Canônica</w:t>
+        <w:t xml:space="preserve">4.4.4 Ricardo (Nostálgico): Pulverização da Fidelidade Canônica</w:t>
       </w:r>
     </w:p>
     <w:p>
@@ -18109,10 +18058,7 @@
         <w:t xml:space="preserve">n. Artistas Únicos: 18 → 126 (+600.0%)</w:t>
       </w:r>
       <w:r>
-        <w:t xml:space="preserve"> </w:t>
-      </w:r>
-      <w:r>
-        <w:t xml:space="preserve">— o maior delta absoluto em qualquer métrica/persona.</w:t>
+        <w:t xml:space="preserve">, o maior delta absoluto em qualquer métrica/persona.</w:t>
       </w:r>
     </w:p>
     <w:p>
@@ -18131,10 +18077,7 @@
         <w:t xml:space="preserve">Shannon Entropy: 4.10 → 6.61 (+61.4%)</w:t>
       </w:r>
       <w:r>
-        <w:t xml:space="preserve"> </w:t>
-      </w:r>
-      <w:r>
-        <w:t xml:space="preserve">— a maior variação relativa de entropia.</w:t>
+        <w:t xml:space="preserve">, a maior variação relativa de entropia.</w:t>
       </w:r>
     </w:p>
     <w:p>
@@ -18153,10 +18096,7 @@
         <w:t xml:space="preserve">Coeficiente de Gini: 0.18 → 0.37 (+110.8%)</w:t>
       </w:r>
       <w:r>
-        <w:t xml:space="preserve"> </w:t>
-      </w:r>
-      <w:r>
-        <w:t xml:space="preserve">— duplicação da desigualdade.</w:t>
+        <w:t xml:space="preserve">, duplicação da desigualdade.</w:t>
       </w:r>
     </w:p>
     <w:p>
@@ -18205,10 +18145,7 @@
         <w:t xml:space="preserve">expandiu o leque de artistas em sete vezes</w:t>
       </w:r>
       <w:r>
-        <w:t xml:space="preserve"> </w:t>
-      </w:r>
-      <w:r>
-        <w:t xml:space="preserve">— recomendando muitos artistas novos com poucas faixas cada, em vez de mais faixas dos mesmos 18 artistas que Ricardo já declarou consumir.</w:t>
+        <w:t xml:space="preserve">, recomendando muitos artistas novos com poucas faixas cada, em vez de mais faixas dos mesmos 18 artistas que Ricardo já declarou consumir.</w:t>
       </w:r>
     </w:p>
     <w:p>
@@ -18283,7 +18220,7 @@
           <w:b/>
           <w:bCs/>
         </w:rPr>
-        <w:t xml:space="preserve">Figura 4.6 — Top 10 Tags por Persona, lado a lado: Input (azul) vs Output (vermelho).</w:t>
+        <w:t xml:space="preserve">Figura 4.6, Top 10 Tags por Persona, lado a lado: Input (azul) vs Output (vermelho).</w:t>
       </w:r>
       <w:r>
         <w:t xml:space="preserve"> </w:t>
@@ -18388,7 +18325,7 @@
         <w:t xml:space="preserve"> </w:t>
       </w:r>
       <w:r>
-        <w:t xml:space="preserve">(−33.6% e −59.4%, respectivamente). Isso decorre matematicamente da expansão do leque: os 18 artistas originais de Ricardo (Metallica, Beatles, Queen, etc.) têm milhões de listeners; os 108 novos artistas introduzidos pelo algoritmo são em média menos consagrados — abaixando a mediana global, mesmo que cada um individualmente seja popular.</w:t>
+        <w:t xml:space="preserve">(−33.6% e −59.4%, respectivamente). Isso decorre matematicamente da expansão do leque: os 18 artistas originais de Ricardo (Metallica, Beatles, Queen, etc.) têm milhões de listeners; os 108 novos artistas introduzidos pelo algoritmo são em média menos consagrados, abaixando a mediana global, mesmo que cada um individualmente seja popular.</w:t>
       </w:r>
     </w:p>
     <w:p>
@@ -18530,10 +18467,7 @@
         <w:t xml:space="preserve">NÃO respeita o comportamento de fidelidade canônica</w:t>
       </w:r>
       <w:r>
-        <w:t xml:space="preserve"> </w:t>
-      </w:r>
-      <w:r>
-        <w:t xml:space="preserve">— ao contrário, ele força a substituição de</w:t>
+        <w:t xml:space="preserve">, ao contrário, ele força a substituição de</w:t>
       </w:r>
       <w:r>
         <w:t xml:space="preserve"> </w:t>
@@ -18633,10 +18567,7 @@
         <w:t xml:space="preserve">achado central deste estudo</w:t>
       </w:r>
       <w:r>
-        <w:t xml:space="preserve"> </w:t>
-      </w:r>
-      <w:r>
-        <w:t xml:space="preserve">— mais sutil e mais robusto do que a hipótese inicial de um</w:t>
+        <w:t xml:space="preserve">, mais sutil e mais robusto do que a hipótese inicial de um</w:t>
       </w:r>
       <w:r>
         <w:t xml:space="preserve"> </w:t>
@@ -18720,7 +18651,7 @@
         <w:tab/>
       </w:r>
       <w:r>
-        <w:t xml:space="preserve">Nível 1 — Conteúdo (artistas): silos preservados, não colapso</w:t>
+        <w:t xml:space="preserve">Nível 1: Conteúdo (artistas): silos preservados, não colapso</w:t>
       </w:r>
     </w:p>
     <w:p>
@@ -18787,10 +18718,7 @@
         <w:t xml:space="preserve">output</w:t>
       </w:r>
       <w:r>
-        <w:t xml:space="preserve"> </w:t>
-      </w:r>
-      <w:r>
-        <w:t xml:space="preserve">— os quatro conjuntos de artistas recomendados são integralmente disjuntos (união de 452 artistas, idêntica à soma dos tamanhos). Um teste de permutação (rótulos de persona reembaralhados sobre o universo combinado, mil reamostragens, correção de Phipson e Smyth (2010)) demonstra que essa separação é</w:t>
+        <w:t xml:space="preserve">, os quatro conjuntos de artistas recomendados são integralmente disjuntos (união de 452 artistas, idêntica à soma dos tamanhos). Um teste de permutação (rótulos de persona reembaralhados sobre o universo combinado, mil reamostragens, correção de Phipson e Smyth (2010)) demonstra que essa separação é</w:t>
       </w:r>
       <w:r>
         <w:t xml:space="preserve"> </w:t>
@@ -18813,7 +18741,7 @@
           <w:b/>
           <w:bCs/>
         </w:rPr>
-        <w:t xml:space="preserve">o algoritmo preserva — e estatisticamente acentua — silos de repertório distintos</w:t>
+        <w:t xml:space="preserve">o algoritmo preserva, e estatisticamente acentua, silos de repertório distintos</w:t>
       </w:r>
       <w:r>
         <w:t xml:space="preserve">.</w:t>
@@ -18835,7 +18763,7 @@
         <w:tab/>
       </w:r>
       <w:r>
-        <w:t xml:space="preserve">Nível 2 — Tema (gêneros/tags): convergência parcial</w:t>
+        <w:t xml:space="preserve">Nível 2: Tema (gêneros/tags): convergência parcial</w:t>
       </w:r>
     </w:p>
     <w:p>
@@ -18882,7 +18810,7 @@
         <w:t xml:space="preserve">embeddings</w:t>
       </w:r>
       <w:r>
-        <w:t xml:space="preserve">) e não por riqueza de artistas — os achados tornam-se compatíveis quando se separa o eixo da</w:t>
+        <w:t xml:space="preserve">) e não por riqueza de artistas, os achados tornam-se compatíveis quando se separa o eixo da</w:t>
       </w:r>
       <w:r>
         <w:t xml:space="preserve"> </w:t>
@@ -18923,7 +18851,7 @@
           <w:b/>
           <w:bCs/>
         </w:rPr>
-        <w:t xml:space="preserve">Tabela 4.4 — Jaccard médio cross-persona (6 pares) vs. nulo de permutação</w:t>
+        <w:t xml:space="preserve">Tabela 4.4, Jaccard médio cross-persona (6 pares) vs. nulo de permutação</w:t>
       </w:r>
     </w:p>
     <w:tbl>
@@ -19182,7 +19110,7 @@
         <w:tab/>
       </w:r>
       <w:r>
-        <w:t xml:space="preserve">Nível 3 — Magnitude da diversidade: convergência por expansão de riqueza</w:t>
+        <w:t xml:space="preserve">Nível 3: Magnitude da diversidade: convergência por expansão de riqueza</w:t>
       </w:r>
     </w:p>
     <w:p>
@@ -19190,7 +19118,7 @@
         <w:pStyle w:val="FirstParagraph"/>
       </w:pPr>
       <w:r>
-        <w:t xml:space="preserve">Há, de fato, convergência da Entropia de Shannon para um patamar comum (~6,5), antes dispersa entre 4,10 e 6,27 — uma redução de ~75% na amplitude entre personas. A Figura 4.7 e a Tabela 4.5 sintetizam o fenômeno:</w:t>
+        <w:t xml:space="preserve">Há, de fato, convergência da Entropia de Shannon para um patamar comum (~6,5), antes dispersa entre 4,10 e 6,27, uma redução de ~75% na amplitude entre personas. A Figura 4.7 e a Tabela 4.5 sintetizam o fenômeno:</w:t>
       </w:r>
     </w:p>
     <w:p>
@@ -19257,7 +19185,7 @@
           <w:b/>
           <w:bCs/>
         </w:rPr>
-        <w:t xml:space="preserve">Figura 4.7 — Shannon Entropy de Artistas, Input (azul) vs Output (vermelho), com delta % anotado.</w:t>
+        <w:t xml:space="preserve">Figura 4.7, Shannon Entropy de Artistas, Input (azul) vs Output (vermelho), com delta % anotado.</w:t>
       </w:r>
       <w:r>
         <w:t xml:space="preserve"> </w:t>
@@ -19275,7 +19203,7 @@
           <w:b/>
           <w:bCs/>
         </w:rPr>
-        <w:t xml:space="preserve">Tabela 4.5 — Convergência da Shannon Entropy (e a evenness de Pielou)</w:t>
+        <w:t xml:space="preserve">Tabela 4.5, Convergência da Shannon Entropy (e a evenness de Pielou)</w:t>
       </w:r>
     </w:p>
     <w:tbl>
@@ -19632,7 +19560,7 @@
         <w:t xml:space="preserve">essa convergência não é homogeneização de entropia, e sim expansão de riqueza de catálogo</w:t>
       </w:r>
       <w:r>
-        <w:t xml:space="preserve">. A evidência é dupla. Primeiro, a evenness de Pielou permanece praticamente constante (0,92–0,98) — para Ricardo, ela inclusive</w:t>
+        <w:t xml:space="preserve">. A evidência é dupla. Primeiro, a evenness de Pielou permanece praticamente constante (0,92–0,98), para Ricardo, ela inclusive</w:t>
       </w:r>
       <w:r>
         <w:t xml:space="preserve"> </w:t>
@@ -19832,7 +19760,7 @@
         <w:t xml:space="preserve"> </w:t>
       </w:r>
       <w:r>
-        <w:t xml:space="preserve">de diversidade —</w:t>
+        <w:t xml:space="preserve">de diversidade,</w:t>
       </w:r>
       <w:r>
         <w:t xml:space="preserve"> </w:t>
@@ -19885,7 +19813,7 @@
           <w:b/>
           <w:bCs/>
         </w:rPr>
-        <w:t xml:space="preserve">Tabela 4.6 — Síntese dos Achados por Persona e Hipóteses Confirmadas</w:t>
+        <w:t xml:space="preserve">Tabela 4.6, Síntese dos Achados por Persona e Hipóteses Confirmadas</w:t>
       </w:r>
     </w:p>
     <w:tbl>
@@ -20215,7 +20143,7 @@
               <w:jc w:val="left"/>
             </w:pPr>
             <w:r>
-              <w:t xml:space="preserve">Pulverização (+600%) — oposto da hipótese</w:t>
+              <w:t xml:space="preserve">Pulverização (+600%), oposto da hipótese</w:t>
             </w:r>
           </w:p>
         </w:tc>
@@ -20372,7 +20300,7 @@
         <w:t xml:space="preserve"> </w:t>
       </w:r>
       <w:r>
-        <w:t xml:space="preserve">de diversidade dos perfis para uma faixa estreita de Shannon (~6,5 bits), mas — como provam a evenness de Pielou plana e a rarefação — isso é</w:t>
+        <w:t xml:space="preserve">de diversidade dos perfis para uma faixa estreita de Shannon (~6,5 bits), mas, como provam a evenness de Pielou plana e a rarefação, isso é</w:t>
       </w:r>
       <w:r>
         <w:t xml:space="preserve"> </w:t>
@@ -20671,10 +20599,7 @@
         <w:t xml:space="preserve">deep cuts</w:t>
       </w:r>
       <w:r>
-        <w:t xml:space="preserve"> </w:t>
-      </w:r>
-      <w:r>
-        <w:t xml:space="preserve">— em coerência com o modelo de negócio da Economia da Atenção (retenção via baixo risco), descrito na Introdução.</w:t>
+        <w:t xml:space="preserve">, em coerência com o modelo de negócio da Economia da Atenção (retenção via baixo risco), descrito na Introdução.</w:t>
       </w:r>
     </w:p>
     <w:p>
@@ -20682,7 +20607,7 @@
         <w:pStyle w:val="BodyText"/>
       </w:pPr>
       <w:r>
-        <w:t xml:space="preserve">A Onda 3 da restrição da API (§3.1.3 e §3.4.1.B) — que removeu silenciosamente os campos</w:t>
+        <w:t xml:space="preserve">A Onda 3 da restrição da API (§3.1.3 e §3.4.1.B), que removeu silenciosamente os campos</w:t>
       </w:r>
       <w:r>
         <w:t xml:space="preserve"> </w:t>
@@ -20724,7 +20649,7 @@
         <w:t xml:space="preserve"> </w:t>
       </w:r>
       <w:r>
-        <w:t xml:space="preserve">durante a execução desta pesquisa — corrobora institucionalmente o argumento: a plataforma</w:t>
+        <w:t xml:space="preserve">durante a execução desta pesquisa, corrobora institucionalmente o argumento: a plataforma</w:t>
       </w:r>
       <w:r>
         <w:t xml:space="preserve"> </w:t>
@@ -20793,7 +20718,7 @@
         <w:t xml:space="preserve"> </w:t>
       </w:r>
       <w:r>
-        <w:t xml:space="preserve">desses artistas — uma forma de</w:t>
+        <w:t xml:space="preserve">desses artistas, uma forma de</w:t>
       </w:r>
       <w:r>
         <w:t xml:space="preserve"> </w:t>
@@ -20919,7 +20844,7 @@
         <w:t xml:space="preserve"> </w:t>
       </w:r>
       <w:r>
-        <w:t xml:space="preserve">(proximidade sonora) — aparente contradição com a elevação de diversidade aqui observada. Os resultados são, porém,</w:t>
+        <w:t xml:space="preserve">(proximidade sonora), aparente contradição com a elevação de diversidade aqui observada. Os resultados são, porém,</w:t>
       </w:r>
       <w:r>
         <w:t xml:space="preserve"> </w:t>
@@ -20992,7 +20917,7 @@
         <w:t xml:space="preserve"> </w:t>
       </w:r>
       <w:r>
-        <w:t xml:space="preserve">a comunalidade entre usuários — aqui, essa comunalidade aparece no nível temático (Jaccard de tags ↑), mas não no de conteúdo (Jaccard de artistas = 0). Por fim, trabalhos recentes de auditoria e</w:t>
+        <w:t xml:space="preserve">a comunalidade entre usuários, aqui, essa comunalidade aparece no nível temático (Jaccard de tags ↑), mas não no de conteúdo (Jaccard de artistas = 0). Por fim, trabalhos recentes de auditoria e</w:t>
       </w:r>
       <w:r>
         <w:t xml:space="preserve"> </w:t>
@@ -21157,7 +21082,7 @@
         <w:pStyle w:val="FirstParagraph"/>
       </w:pPr>
       <w:r>
-        <w:t xml:space="preserve">Apesar dessas limitações, a triangulação metodológica adotada (Shannon, Gini, HHI, Listeners, Playcount, Era de Carreira, Tipo de Artista — sete famílias de métricas independentes) e o uso de duas fontes externas validadas (Last.fm + MusicBrainz) conferem ao conjunto de achados uma robustez que justifica os resultados aqui apresentados como</w:t>
+        <w:t xml:space="preserve">Apesar dessas limitações, a triangulação metodológica adotada (Shannon, Gini, HHI, Listeners, Playcount, Era de Carreira, Tipo de Artista, sete famílias de métricas independentes) e o uso de duas fontes externas validadas (Last.fm + MusicBrainz) conferem ao conjunto de achados uma robustez que justifica os resultados aqui apresentados como</w:t>
       </w:r>
       <w:r>
         <w:t xml:space="preserve"> </w:t>
@@ -21202,7 +21127,7 @@
         <w:pStyle w:val="FirstParagraph"/>
       </w:pPr>
       <w:r>
-        <w:t xml:space="preserve">Este trabalho teve como objetivo geral auditar o comportamento do sistema de recomendação do Spotify, por meio de uma metodologia de caixa-preta com personas sintéticas, a fim de mensurar o impacto da curadoria algorítmica sobre a diversidade cultural. O conjunto de evidências reunido permite responder afirmativamente à pergunta condutora — o algoritmo interfere de modo sistemático e mensurável sobre o gosto declarado —, mas exige refinar a forma como essa interferência é compreendida.</w:t>
+        <w:t xml:space="preserve">Este trabalho teve como objetivo geral auditar o comportamento do sistema de recomendação do Spotify, por meio de uma metodologia de caixa-preta com personas sintéticas, a fim de mensurar o impacto da curadoria algorítmica sobre a diversidade cultural. O conjunto de evidências reunido permite responder afirmativamente à pergunta condutora, o algoritmo interfere de modo sistemático e mensurável sobre o gosto declarado, mas exige refinar a forma como essa interferência é compreendida.</w:t>
       </w:r>
     </w:p>
     <w:p>
@@ -21278,7 +21203,7 @@
         <w:t xml:space="preserve"> </w:t>
       </w:r>
       <w:r>
-        <w:t xml:space="preserve">por meio de playlists espelho e do enriquecimento via Last.fm e MusicBrainz. Quarto, a diversidade e a concentração foram mensuradas por um conjunto triangulado de indicadores — Entropia de Shannon,</w:t>
+        <w:t xml:space="preserve">por meio de playlists espelho e do enriquecimento via Last.fm e MusicBrainz. Quarto, a diversidade e a concentração foram mensuradas por um conjunto triangulado de indicadores, Entropia de Shannon,</w:t>
       </w:r>
       <w:r>
         <w:t xml:space="preserve"> </w:t>
@@ -21294,7 +21219,7 @@
         <w:t xml:space="preserve"> </w:t>
       </w:r>
       <w:r>
-        <w:t xml:space="preserve">de Pielou, Coeficiente de Gini, HHI e Jaccard —, acompanhados de tratamento estatístico inferencial.</w:t>
+        <w:t xml:space="preserve">de Pielou, Coeficiente de Gini, HHI e Jaccard, acompanhados de tratamento estatístico inferencial.</w:t>
       </w:r>
     </w:p>
     <w:p>
@@ -21369,7 +21294,7 @@
         <w:t xml:space="preserve">magnitude da diversidade</w:t>
       </w:r>
       <w:r>
-        <w:t xml:space="preserve">, a aparente convergência da Entropia de Shannon é, na realidade, expansão de riqueza de catálogo — comprovada pela</w:t>
+        <w:t xml:space="preserve">, a aparente convergência da Entropia de Shannon é, na realidade, expansão de riqueza de catálogo, comprovada pela</w:t>
       </w:r>
       <w:r>
         <w:t xml:space="preserve"> </w:t>
@@ -21385,7 +21310,7 @@
         <w:t xml:space="preserve"> </w:t>
       </w:r>
       <w:r>
-        <w:t xml:space="preserve">de Pielou praticamente constante e pela análise de rarefação —, e não homogeneização de entropia. Assim, o algoritmo não homogeneíza o gosto entre usuários: ele alarga internamente a bolha de cada perfil e os aproxima tematicamente, mas preserva paredes de conteúdo distintas.</w:t>
+        <w:t xml:space="preserve">de Pielou praticamente constante e pela análise de rarefação, e não homogeneização de entropia. Assim, o algoritmo não homogeneíza o gosto entre usuários: ele alarga internamente a bolha de cada perfil e os aproxima tematicamente, mas preserva paredes de conteúdo distintas.</w:t>
       </w:r>
     </w:p>
     <w:p>
@@ -21421,7 +21346,7 @@
         <w:t xml:space="preserve"> </w:t>
       </w:r>
       <w:r>
-        <w:t xml:space="preserve">que, mesmo respeitando a cauda longa no eixo do artista, força as faixas mais expostas no eixo da obra (Sofia, +405% de ouvintes por faixa). De modo contraintuitivo, o perfil de fidelidade canônica (Ricardo) teve sua bolha vertical arrombada, com expansão de 18 para 126 artistas — o oposto do estagnamento temporal hipotetizado.</w:t>
+        <w:t xml:space="preserve">que, mesmo respeitando a cauda longa no eixo do artista, força as faixas mais expostas no eixo da obra (Sofia, +405% de ouvintes por faixa). De modo contraintuitivo, o perfil de fidelidade canônica (Ricardo) teve sua bolha vertical arrombada, com expansão de 18 para 126 artistas, o oposto do estagnamento temporal hipotetizado.</w:t>
       </w:r>
     </w:p>
     <w:p>
@@ -21509,7 +21434,7 @@
         <w:t xml:space="preserve"> </w:t>
       </w:r>
       <w:r>
-        <w:t xml:space="preserve">durante a própria execução da auditoria — ilustração concreta da opacidade e da assimetria informacional que motivam, sob a ótica da Gestão da Informação, a agenda de auditoria algorítmica.</w:t>
+        <w:t xml:space="preserve">durante a própria execução da auditoria, ilustração concreta da opacidade e da assimetria informacional que motivam, sob a ótica da Gestão da Informação, a agenda de auditoria algorítmica.</w:t>
       </w:r>
     </w:p>
     <w:p>
@@ -21634,7 +21559,7 @@
         <w:t xml:space="preserve"> </w:t>
       </w:r>
       <w:r>
-        <w:t xml:space="preserve">ele o faz — distinção decisiva para o debate sobre diversidade cultural na era da governança algorítmica.</w:t>
+        <w:t xml:space="preserve">ele o faz, distinção decisiva para o debate sobre diversidade cultural na era da governança algorítmica.</w:t>
       </w:r>
     </w:p>
     <w:bookmarkEnd w:id="177"/>
@@ -21835,7 +21760,7 @@
         <w:pStyle w:val="BodyText"/>
       </w:pPr>
       <w:r>
-        <w:t xml:space="preserve">SANDVIG, Christian; HAMILTON, Kevin; KARAHALIOS, Karrie; LANGBORT, Cedric. Auditing Algorithms: Research Methods for Detecting Discrimination on Internet Platforms. In: DATA AND DISCRIMINATION: CONVERTING CRITICAL CONCERNS INTO PRODUCTIVE INQUIRY — pré-conferência do 64º Encontro Anual da International Communication Association (ICA). Seattle, 22 maio 2014.</w:t>
+        <w:t xml:space="preserve">SANDVIG, Christian; HAMILTON, Kevin; KARAHALIOS, Karrie; LANGBORT, Cedric. Auditing Algorithms: Research Methods for Detecting Discrimination on Internet Platforms. In: DATA AND DISCRIMINATION: CONVERTING CRITICAL CONCERNS INTO PRODUCTIVE INQUIRY, pré-conferência do 64º Encontro Anual da International Communication Association (ICA). Seattle, 22 maio 2014.</w:t>
       </w:r>
     </w:p>
     <w:p>

</xml_diff>